<commit_message>
docs(qa): update Reports 1-4 and 6, finalize Report3 and build Report7 final project report
</commit_message>
<xml_diff>
--- a/docs/qa/Report2_Project_Management_Plan.docx
+++ b/docs/qa/Report2_Project_Management_Plan.docx
@@ -25,12 +25,12 @@
           <wp:inline distB="0" distT="0" distL="0" distR="0">
             <wp:extent cx="2707537" cy="832092"/>
             <wp:effectExtent b="0" l="0" r="0" t="0"/>
-            <wp:docPr id="1" name="image2.png"/>
+            <wp:docPr id="1" name="image1.png"/>
             <a:graphic>
               <a:graphicData uri="http://schemas.openxmlformats.org/drawingml/2006/picture">
                 <pic:pic>
                   <pic:nvPicPr>
-                    <pic:cNvPr id="0" name="image2.png"/>
+                    <pic:cNvPr id="0" name="image1.png"/>
                     <pic:cNvPicPr preferRelativeResize="0"/>
                   </pic:nvPicPr>
                   <pic:blipFill>
@@ -309,7 +309,7 @@
     </w:p>
     <w:sdt>
       <w:sdtPr>
-        <w:id w:val="2013326564"/>
+        <w:id w:val="-11216728"/>
         <w:docPartObj>
           <w:docPartGallery w:val="Table of Contents"/>
           <w:docPartUnique w:val="1"/>
@@ -10208,6 +10208,74 @@
       </w:pPr>
       <w:r>
         <w:rPr>
+          <w:rtl w:val="0"/>
+        </w:rPr>
+      </w:r>
+    </w:p>
+    <w:p>
+      <w:pPr>
+        <w:spacing w:before="200" w:line="360" w:lineRule="auto"/>
+        <w:jc w:val="center"/>
+        <w:rPr>
+          <w:i w:val="1"/>
+          <w:iCs w:val="1"/>
+          <w:sz w:val="24"/>
+          <w:szCs w:val="24"/>
+        </w:rPr>
+      </w:pPr>
+      <w:r>
+        <w:rPr>
+          <w:rtl w:val="0"/>
+        </w:rPr>
+      </w:r>
+    </w:p>
+    <w:p>
+      <w:pPr>
+        <w:spacing w:before="200" w:line="360" w:lineRule="auto"/>
+        <w:jc w:val="center"/>
+        <w:rPr>
+          <w:i w:val="1"/>
+          <w:iCs w:val="1"/>
+          <w:sz w:val="24"/>
+          <w:szCs w:val="24"/>
+        </w:rPr>
+      </w:pPr>
+      <w:r>
+        <w:rPr>
+          <w:rtl w:val="0"/>
+        </w:rPr>
+      </w:r>
+    </w:p>
+    <w:p>
+      <w:pPr>
+        <w:spacing w:before="200" w:line="360" w:lineRule="auto"/>
+        <w:jc w:val="center"/>
+        <w:rPr>
+          <w:i w:val="1"/>
+          <w:iCs w:val="1"/>
+          <w:sz w:val="24"/>
+          <w:szCs w:val="24"/>
+        </w:rPr>
+      </w:pPr>
+      <w:r>
+        <w:rPr>
+          <w:rtl w:val="0"/>
+        </w:rPr>
+      </w:r>
+    </w:p>
+    <w:p>
+      <w:pPr>
+        <w:spacing w:before="200" w:line="360" w:lineRule="auto"/>
+        <w:jc w:val="center"/>
+        <w:rPr>
+          <w:i w:val="1"/>
+          <w:iCs w:val="1"/>
+          <w:sz w:val="24"/>
+          <w:szCs w:val="24"/>
+        </w:rPr>
+      </w:pPr>
+      <w:r>
+        <w:rPr>
           <w:i w:val="1"/>
           <w:iCs w:val="1"/>
           <w:sz w:val="24"/>
@@ -11992,6 +12060,39 @@
     </w:p>
     <w:p>
       <w:pPr>
+        <w:spacing w:line="360" w:lineRule="auto"/>
+        <w:rPr/>
+      </w:pPr>
+      <w:r>
+        <w:rPr>
+          <w:rtl w:val="0"/>
+        </w:rPr>
+      </w:r>
+    </w:p>
+    <w:p>
+      <w:pPr>
+        <w:spacing w:line="360" w:lineRule="auto"/>
+        <w:rPr/>
+      </w:pPr>
+      <w:r>
+        <w:rPr>
+          <w:rtl w:val="0"/>
+        </w:rPr>
+      </w:r>
+    </w:p>
+    <w:p>
+      <w:pPr>
+        <w:spacing w:line="360" w:lineRule="auto"/>
+        <w:rPr/>
+      </w:pPr>
+      <w:r>
+        <w:rPr>
+          <w:rtl w:val="0"/>
+        </w:rPr>
+      </w:r>
+    </w:p>
+    <w:p>
+      <w:pPr>
         <w:pStyle w:val="Heading2"/>
         <w:spacing w:line="360" w:lineRule="auto"/>
         <w:rPr/>
@@ -12039,12 +12140,12 @@
           <wp:inline distB="114300" distT="114300" distL="114300" distR="114300">
             <wp:extent cx="5746440" cy="3200400"/>
             <wp:effectExtent b="0" l="0" r="0" t="0"/>
-            <wp:docPr id="3" name="image3.png"/>
+            <wp:docPr id="3" name="image2.png"/>
             <a:graphic>
               <a:graphicData uri="http://schemas.openxmlformats.org/drawingml/2006/picture">
                 <pic:pic>
                   <pic:nvPicPr>
-                    <pic:cNvPr id="0" name="image3.png"/>
+                    <pic:cNvPr id="0" name="image2.png"/>
                     <pic:cNvPicPr preferRelativeResize="0"/>
                   </pic:nvPicPr>
                   <pic:blipFill>
@@ -15097,6 +15198,105 @@
     </w:p>
     <w:p>
       <w:pPr>
+        <w:spacing w:line="360" w:lineRule="auto"/>
+        <w:rPr/>
+      </w:pPr>
+      <w:r>
+        <w:rPr>
+          <w:rtl w:val="0"/>
+        </w:rPr>
+      </w:r>
+    </w:p>
+    <w:p>
+      <w:pPr>
+        <w:spacing w:line="360" w:lineRule="auto"/>
+        <w:rPr/>
+      </w:pPr>
+      <w:r>
+        <w:rPr>
+          <w:rtl w:val="0"/>
+        </w:rPr>
+      </w:r>
+    </w:p>
+    <w:p>
+      <w:pPr>
+        <w:spacing w:line="360" w:lineRule="auto"/>
+        <w:rPr/>
+      </w:pPr>
+      <w:r>
+        <w:rPr>
+          <w:rtl w:val="0"/>
+        </w:rPr>
+      </w:r>
+    </w:p>
+    <w:p>
+      <w:pPr>
+        <w:spacing w:line="360" w:lineRule="auto"/>
+        <w:rPr/>
+      </w:pPr>
+      <w:r>
+        <w:rPr>
+          <w:rtl w:val="0"/>
+        </w:rPr>
+      </w:r>
+    </w:p>
+    <w:p>
+      <w:pPr>
+        <w:spacing w:line="360" w:lineRule="auto"/>
+        <w:rPr/>
+      </w:pPr>
+      <w:r>
+        <w:rPr>
+          <w:rtl w:val="0"/>
+        </w:rPr>
+      </w:r>
+    </w:p>
+    <w:p>
+      <w:pPr>
+        <w:spacing w:line="360" w:lineRule="auto"/>
+        <w:rPr/>
+      </w:pPr>
+      <w:r>
+        <w:rPr>
+          <w:rtl w:val="0"/>
+        </w:rPr>
+      </w:r>
+    </w:p>
+    <w:p>
+      <w:pPr>
+        <w:spacing w:line="360" w:lineRule="auto"/>
+        <w:rPr/>
+      </w:pPr>
+      <w:r>
+        <w:rPr>
+          <w:rtl w:val="0"/>
+        </w:rPr>
+      </w:r>
+    </w:p>
+    <w:p>
+      <w:pPr>
+        <w:spacing w:line="360" w:lineRule="auto"/>
+        <w:rPr/>
+      </w:pPr>
+      <w:r>
+        <w:rPr>
+          <w:rtl w:val="0"/>
+        </w:rPr>
+      </w:r>
+    </w:p>
+    <w:p>
+      <w:pPr>
+        <w:spacing w:line="360" w:lineRule="auto"/>
+        <w:rPr/>
+      </w:pPr>
+      <w:r>
+        <w:rPr>
+          <w:rtl w:val="0"/>
+        </w:rPr>
+      </w:r>
+    </w:p>
+    <w:p>
+      <w:pPr>
         <w:pStyle w:val="Heading2"/>
         <w:spacing w:line="360" w:lineRule="auto"/>
         <w:rPr/>
@@ -15184,12 +15384,12 @@
           <wp:inline distB="114300" distT="114300" distL="114300" distR="114300">
             <wp:extent cx="5746440" cy="3352800"/>
             <wp:effectExtent b="0" l="0" r="0" t="0"/>
-            <wp:docPr id="2" name="image1.png"/>
+            <wp:docPr id="2" name="image3.png"/>
             <a:graphic>
               <a:graphicData uri="http://schemas.openxmlformats.org/drawingml/2006/picture">
                 <pic:pic>
                   <pic:nvPicPr>
-                    <pic:cNvPr id="0" name="image1.png"/>
+                    <pic:cNvPr id="0" name="image3.png"/>
                     <pic:cNvPicPr preferRelativeResize="0"/>
                   </pic:nvPicPr>
                   <pic:blipFill>

</xml_diff>